<commit_message>
Rename Blog to Resources
The page is becoming a home for articles and guides rather than a blog, so
blog.html is now resources.html with nav, titles and social tags updated
across all 21 pages.

Wording: hero reads "Resources — Articles, guides, and recommended reading
to go alongside the playbooks"; the homepage section heading changes from
"From the Blog" to "Resources" and its button from "View All Posts" to
"Browse Resources".

blog.html remains as a redirect so any link already shared still lands in
the right place. The page stays members-only.

Co-Authored-By: Claude Opus 5 <noreply@anthropic.com>
</commit_message>
<xml_diff>
--- a/What is ADHD?.docx
+++ b/What is ADHD?.docx
@@ -1,6 +1,6 @@
 
 <file path=word/document.xml><?xml version="1.0" encoding="utf-8"?>
-<w:document xmlns:wpc="http://schemas.microsoft.com/office/word/2010/wordprocessingCanvas" xmlns:cx="http://schemas.microsoft.com/office/drawing/2014/chartex" xmlns:cx1="http://schemas.microsoft.com/office/drawing/2015/9/8/chartex" xmlns:cx2="http://schemas.microsoft.com/office/drawing/2015/10/21/chartex" xmlns:cx3="http://schemas.microsoft.com/office/drawing/2016/5/9/chartex" xmlns:cx4="http://schemas.microsoft.com/office/drawing/2016/5/10/chartex" xmlns:cx5="http://schemas.microsoft.com/office/drawing/2016/5/11/chartex" xmlns:cx6="http://schemas.microsoft.com/office/drawing/2016/5/12/chartex" xmlns:cx7="http://schemas.microsoft.com/office/drawing/2016/5/13/chartex" xmlns:cx8="http://schemas.microsoft.com/office/drawing/2016/5/14/chartex" xmlns:mc="http://schemas.openxmlformats.org/markup-compatibility/2006" xmlns:aink="http://schemas.microsoft.com/office/drawing/2016/ink" xmlns:am3d="http://schemas.microsoft.com/office/drawing/2017/model3d" xmlns:o="urn:schemas-microsoft-com:office:office" xmlns:oel="http://schemas.microsoft.com/office/2019/extlst" xmlns:r="http://schemas.openxmlformats.org/officeDocument/2006/relationships" xmlns:m="http://schemas.openxmlformats.org/officeDocument/2006/math" xmlns:v="urn:schemas-microsoft-com:vml" xmlns:wp14="http://schemas.microsoft.com/office/word/2010/wordprocessingDrawing" xmlns:wp="http://schemas.openxmlformats.org/drawingml/2006/wordprocessingDrawing" xmlns:w10="urn:schemas-microsoft-com:office:word" xmlns:w="http://schemas.openxmlformats.org/wordprocessingml/2006/main" xmlns:w14="http://schemas.microsoft.com/office/word/2010/wordml" xmlns:w15="http://schemas.microsoft.com/office/word/2012/wordml" xmlns:w16cex="http://schemas.microsoft.com/office/word/2018/wordml/cex" xmlns:w16cid="http://schemas.microsoft.com/office/word/2016/wordml/cid" xmlns:w16="http://schemas.microsoft.com/office/word/2018/wordml" xmlns:w16du="http://schemas.microsoft.com/office/word/2023/wordml/word16du" xmlns:w16sdtdh="http://schemas.microsoft.com/office/word/2020/wordml/sdtdatahash" xmlns:w16sdtfl="http://schemas.microsoft.com/office/word/2024/wordml/sdtformatlock" xmlns:w16se="http://schemas.microsoft.com/office/word/2015/wordml/symex" xmlns:wpg="http://schemas.microsoft.com/office/word/2010/wordprocessingGroup" xmlns:wpi="http://schemas.microsoft.com/office/word/2010/wordprocessingInk" xmlns:wne="http://schemas.microsoft.com/office/word/2006/wordml" xmlns:wps="http://schemas.microsoft.com/office/word/2010/wordprocessingShape" mc:Ignorable="w14 w15 w16se w16cid w16 w16cex w16sdtdh w16sdtfl w16du wp14">
+<w:document xmlns:wpc="http://schemas.microsoft.com/office/word/2010/wordprocessingCanvas" xmlns:cx="http://schemas.microsoft.com/office/drawing/2014/chartex" xmlns:cx1="http://schemas.microsoft.com/office/drawing/2015/9/8/chartex" xmlns:cx2="http://schemas.microsoft.com/office/drawing/2015/10/21/chartex" xmlns:cx3="http://schemas.microsoft.com/office/drawing/2016/5/9/chartex" xmlns:cx4="http://schemas.microsoft.com/office/drawing/2016/5/10/chartex" xmlns:cx5="http://schemas.microsoft.com/office/drawing/2016/5/11/chartex" xmlns:cx6="http://schemas.microsoft.com/office/drawing/2016/5/12/chartex" xmlns:cx7="http://schemas.microsoft.com/office/drawing/2016/5/13/chartex" xmlns:cx8="http://schemas.microsoft.com/office/drawing/2016/5/14/chartex" xmlns:mc="http://schemas.openxmlformats.org/markup-compatibility/2006" xmlns:m="http://schemas.openxmlformats.org/officeDocument/2006/math" xmlns:aink="http://schemas.microsoft.com/office/drawing/2016/ink" xmlns:am3d="http://schemas.microsoft.com/office/drawing/2017/model3d" xmlns:oel="http://schemas.microsoft.com/office/2019/extlst" xmlns:r="http://schemas.openxmlformats.org/officeDocument/2006/relationships" xmlns:wp14="http://schemas.microsoft.com/office/word/2010/wordprocessingDrawing" xmlns:wp="http://schemas.openxmlformats.org/drawingml/2006/wordprocessingDrawing" xmlns:wpg="http://schemas.microsoft.com/office/word/2010/wordprocessingGroup" xmlns:wpi="http://schemas.microsoft.com/office/word/2010/wordprocessingInk" xmlns:wps="http://schemas.microsoft.com/office/word/2010/wordprocessingShape" xmlns:o="urn:schemas-microsoft-com:office:office" xmlns:v="urn:schemas-microsoft-com:vml" xmlns:w10="urn:schemas-microsoft-com:office:word" xmlns:w="http://schemas.openxmlformats.org/wordprocessingml/2006/main" xmlns:w14="http://schemas.microsoft.com/office/word/2010/wordml" xmlns:w15="http://schemas.microsoft.com/office/word/2012/wordml" xmlns:w16cex="http://schemas.microsoft.com/office/word/2018/wordml/cex" xmlns:w16cid="http://schemas.microsoft.com/office/word/2016/wordml/cid" xmlns:w16="http://schemas.microsoft.com/office/word/2018/wordml" xmlns:w16sdtdh="http://schemas.microsoft.com/office/word/2020/wordml/sdtdatahash" xmlns:w16sdtfl="http://schemas.microsoft.com/office/word/2024/wordml/sdtformatlock" xmlns:w16se="http://schemas.microsoft.com/office/word/2015/wordml/symex" xmlns:w16du="http://schemas.microsoft.com/office/word/2023/wordml/word16du" xmlns:wne="http://schemas.microsoft.com/office/word/2006/wordml" mc:Ignorable="w14 w15 w16se w16cid w16 w16cex w16sdtdh w16sdtfl w16du wp14">
   <w:body>
     <w:p>
       <w:pPr>
@@ -157,25 +157,7 @@
           <w:kern w:val="0"/>
           <w14:ligatures w14:val="none"/>
         </w:rPr>
-        <w:t xml:space="preserve"> with ADHD often </w:t>
-      </w:r>
-      <w:proofErr w:type="gramStart"/>
-      <w:r>
-        <w:rPr>
-          <w:rFonts w:ascii="Times New Roman" w:eastAsia="Times New Roman" w:hAnsi="Times New Roman" w:cs="Times New Roman"/>
-          <w:kern w:val="0"/>
-          <w14:ligatures w14:val="none"/>
-        </w:rPr>
-        <w:t>have the ability to</w:t>
-      </w:r>
-      <w:proofErr w:type="gramEnd"/>
-      <w:r>
-        <w:rPr>
-          <w:rFonts w:ascii="Times New Roman" w:eastAsia="Times New Roman" w:hAnsi="Times New Roman" w:cs="Times New Roman"/>
-          <w:kern w:val="0"/>
-          <w14:ligatures w14:val="none"/>
-        </w:rPr>
-        <w:t xml:space="preserve"> focus very well on activities they find highly interesting or rewarding. However, they may struggle to direct and sustain attention on tasks that are repetitive, less stimulating, or require </w:t>
+        <w:t xml:space="preserve"> with ADHD often have the ability to focus very well on activities they find highly interesting or rewarding. However, they may struggle to direct and sustain attention on tasks that are repetitive, less stimulating, or require </w:t>
       </w:r>
       <w:r>
         <w:rPr>
@@ -1200,25 +1182,7 @@
           <w:kern w:val="0"/>
           <w14:ligatures w14:val="none"/>
         </w:rPr>
-        <w:t xml:space="preserve">Becoming </w:t>
-      </w:r>
-      <w:proofErr w:type="spellStart"/>
-      <w:r>
-        <w:rPr>
-          <w:rFonts w:ascii="Times New Roman" w:eastAsia="Times New Roman" w:hAnsi="Times New Roman" w:cs="Times New Roman"/>
-          <w:kern w:val="0"/>
-          <w14:ligatures w14:val="none"/>
-        </w:rPr>
-        <w:t>self aware</w:t>
-      </w:r>
-      <w:proofErr w:type="spellEnd"/>
-      <w:r>
-        <w:rPr>
-          <w:rFonts w:ascii="Times New Roman" w:eastAsia="Times New Roman" w:hAnsi="Times New Roman" w:cs="Times New Roman"/>
-          <w:kern w:val="0"/>
-          <w14:ligatures w14:val="none"/>
-        </w:rPr>
-        <w:t xml:space="preserve"> about</w:t>
+        <w:t>Becoming self aware about</w:t>
       </w:r>
       <w:r>
         <w:rPr>
@@ -1261,6 +1225,598 @@
           <w14:ligatures w14:val="none"/>
         </w:rPr>
         <w:t>With appropriate treatment and self-understanding, people with ADHD can thrive academically, professionally, and personally. The goal of treatment is not to change who someone is, but to reduce the barriers that prevent them from reaching their full potential.</w:t>
+      </w:r>
+    </w:p>
+    <w:p>
+      <w:pPr>
+        <w:spacing w:before="100" w:beforeAutospacing="1" w:after="100" w:afterAutospacing="1" w:line="240" w:lineRule="auto"/>
+        <w:rPr>
+          <w:rFonts w:ascii="Times New Roman" w:eastAsia="Times New Roman" w:hAnsi="Times New Roman" w:cs="Times New Roman"/>
+          <w:kern w:val="0"/>
+          <w14:ligatures w14:val="none"/>
+        </w:rPr>
+      </w:pPr>
+      <w:r>
+        <w:t>Many with ADHD spend years believing they're lazy, undisciplined, or simply "not trying hard enough." In reality, ADHD is not a character flaw</w:t>
+      </w:r>
+      <w:r>
+        <w:t xml:space="preserve">, </w:t>
+      </w:r>
+      <w:r>
+        <w:t>it's a difference in how the brain manages attention, motivation, and executive functioning. Understanding that distinction often replaces years of self-criticism with self-compassion and opens the door to more effective strategies for success.</w:t>
+      </w:r>
+    </w:p>
+    <w:p>
+      <w:pPr>
+        <w:spacing w:before="100" w:beforeAutospacing="1" w:after="100" w:afterAutospacing="1" w:line="240" w:lineRule="auto"/>
+        <w:outlineLvl w:val="0"/>
+        <w:rPr>
+          <w:rFonts w:ascii="Times New Roman" w:eastAsia="Times New Roman" w:hAnsi="Times New Roman" w:cs="Times New Roman"/>
+          <w:b/>
+          <w:bCs/>
+          <w:kern w:val="36"/>
+          <w:sz w:val="48"/>
+          <w:szCs w:val="48"/>
+          <w14:ligatures w14:val="none"/>
+        </w:rPr>
+      </w:pPr>
+      <w:r>
+        <w:rPr>
+          <w:rFonts w:ascii="Apple Color Emoji" w:eastAsia="Times New Roman" w:hAnsi="Apple Color Emoji" w:cs="Apple Color Emoji"/>
+          <w:b/>
+          <w:bCs/>
+          <w:kern w:val="36"/>
+          <w:sz w:val="48"/>
+          <w:szCs w:val="48"/>
+          <w14:ligatures w14:val="none"/>
+        </w:rPr>
+        <w:t>🧠</w:t>
+      </w:r>
+      <w:r>
+        <w:rPr>
+          <w:rFonts w:ascii="Times New Roman" w:eastAsia="Times New Roman" w:hAnsi="Times New Roman" w:cs="Times New Roman"/>
+          <w:b/>
+          <w:bCs/>
+          <w:kern w:val="36"/>
+          <w:sz w:val="48"/>
+          <w:szCs w:val="48"/>
+          <w14:ligatures w14:val="none"/>
+        </w:rPr>
+        <w:t xml:space="preserve"> Your Mental Playbook</w:t>
+      </w:r>
+    </w:p>
+    <w:p>
+      <w:pPr>
+        <w:spacing w:before="100" w:beforeAutospacing="1" w:after="100" w:afterAutospacing="1" w:line="240" w:lineRule="auto"/>
+        <w:outlineLvl w:val="1"/>
+        <w:rPr>
+          <w:rFonts w:ascii="Times New Roman" w:eastAsia="Times New Roman" w:hAnsi="Times New Roman" w:cs="Times New Roman"/>
+          <w:b/>
+          <w:bCs/>
+          <w:kern w:val="0"/>
+          <w:sz w:val="36"/>
+          <w:szCs w:val="36"/>
+          <w14:ligatures w14:val="none"/>
+        </w:rPr>
+      </w:pPr>
+      <w:r>
+        <w:rPr>
+          <w:rFonts w:ascii="Times New Roman" w:eastAsia="Times New Roman" w:hAnsi="Times New Roman" w:cs="Times New Roman"/>
+          <w:b/>
+          <w:bCs/>
+          <w:kern w:val="0"/>
+          <w:sz w:val="36"/>
+          <w:szCs w:val="36"/>
+          <w14:ligatures w14:val="none"/>
+        </w:rPr>
+        <w:t>One Thing to Remember</w:t>
+      </w:r>
+    </w:p>
+    <w:p>
+      <w:pPr>
+        <w:spacing w:before="100" w:beforeAutospacing="1" w:after="100" w:afterAutospacing="1" w:line="240" w:lineRule="auto"/>
+        <w:rPr>
+          <w:rFonts w:ascii="Times New Roman" w:eastAsia="Times New Roman" w:hAnsi="Times New Roman" w:cs="Times New Roman"/>
+          <w:kern w:val="0"/>
+          <w14:ligatures w14:val="none"/>
+        </w:rPr>
+      </w:pPr>
+      <w:r>
+        <w:rPr>
+          <w:rFonts w:ascii="Times New Roman" w:eastAsia="Times New Roman" w:hAnsi="Times New Roman" w:cs="Times New Roman"/>
+          <w:b/>
+          <w:bCs/>
+          <w:kern w:val="0"/>
+          <w14:ligatures w14:val="none"/>
+        </w:rPr>
+        <w:t>ADHD isn't a lack of attention</w:t>
+      </w:r>
+      <w:r>
+        <w:rPr>
+          <w:rFonts w:ascii="Times New Roman" w:eastAsia="Times New Roman" w:hAnsi="Times New Roman" w:cs="Times New Roman"/>
+          <w:b/>
+          <w:bCs/>
+          <w:kern w:val="0"/>
+          <w14:ligatures w14:val="none"/>
+        </w:rPr>
+        <w:t xml:space="preserve">, </w:t>
+      </w:r>
+      <w:r>
+        <w:rPr>
+          <w:rFonts w:ascii="Times New Roman" w:eastAsia="Times New Roman" w:hAnsi="Times New Roman" w:cs="Times New Roman"/>
+          <w:b/>
+          <w:bCs/>
+          <w:kern w:val="0"/>
+          <w14:ligatures w14:val="none"/>
+        </w:rPr>
+        <w:t>it's a challenge with regulating attention. Your brain isn't broken; it simply responds differently to motivation, interest, and stimulation.</w:t>
+      </w:r>
+    </w:p>
+    <w:p>
+      <w:pPr>
+        <w:spacing w:before="100" w:beforeAutospacing="1" w:after="100" w:afterAutospacing="1" w:line="240" w:lineRule="auto"/>
+        <w:rPr>
+          <w:rFonts w:ascii="Times New Roman" w:eastAsia="Times New Roman" w:hAnsi="Times New Roman" w:cs="Times New Roman"/>
+          <w:kern w:val="0"/>
+          <w14:ligatures w14:val="none"/>
+        </w:rPr>
+      </w:pPr>
+      <w:r>
+        <w:rPr>
+          <w:rFonts w:ascii="Times New Roman" w:eastAsia="Times New Roman" w:hAnsi="Times New Roman" w:cs="Times New Roman"/>
+          <w:kern w:val="0"/>
+          <w14:ligatures w14:val="none"/>
+        </w:rPr>
+        <w:t xml:space="preserve">Understanding that difference allows you to stop asking, </w:t>
+      </w:r>
+      <w:r>
+        <w:rPr>
+          <w:rFonts w:ascii="Times New Roman" w:eastAsia="Times New Roman" w:hAnsi="Times New Roman" w:cs="Times New Roman"/>
+          <w:i/>
+          <w:iCs/>
+          <w:kern w:val="0"/>
+          <w14:ligatures w14:val="none"/>
+        </w:rPr>
+        <w:t>"What's wrong with me?"</w:t>
+      </w:r>
+      <w:r>
+        <w:rPr>
+          <w:rFonts w:ascii="Times New Roman" w:eastAsia="Times New Roman" w:hAnsi="Times New Roman" w:cs="Times New Roman"/>
+          <w:kern w:val="0"/>
+          <w14:ligatures w14:val="none"/>
+        </w:rPr>
+        <w:t xml:space="preserve"> and start asking, </w:t>
+      </w:r>
+      <w:r>
+        <w:rPr>
+          <w:rFonts w:ascii="Times New Roman" w:eastAsia="Times New Roman" w:hAnsi="Times New Roman" w:cs="Times New Roman"/>
+          <w:i/>
+          <w:iCs/>
+          <w:kern w:val="0"/>
+          <w14:ligatures w14:val="none"/>
+        </w:rPr>
+        <w:t>"How can I work with the way my brain functions?"</w:t>
+      </w:r>
+    </w:p>
+    <w:p>
+      <w:pPr>
+        <w:spacing w:after="0" w:line="240" w:lineRule="auto"/>
+        <w:rPr>
+          <w:rFonts w:ascii="Times New Roman" w:eastAsia="Times New Roman" w:hAnsi="Times New Roman" w:cs="Times New Roman"/>
+          <w:kern w:val="0"/>
+          <w14:ligatures w14:val="none"/>
+        </w:rPr>
+      </w:pPr>
+      <w:r>
+        <w:rPr>
+          <w:rFonts w:ascii="Times New Roman" w:eastAsia="Times New Roman" w:hAnsi="Times New Roman" w:cs="Times New Roman"/>
+          <w:noProof/>
+          <w:kern w:val="0"/>
+        </w:rPr>
+        <w:pict w14:anchorId="1337EEAA">
+          <v:rect id="_x0000_i1027" alt="" style="width:468pt;height:.05pt;mso-width-percent:0;mso-height-percent:0;mso-width-percent:0;mso-height-percent:0" o:hralign="center" o:hrstd="t" o:hr="t" fillcolor="#a0a0a0" stroked="f"/>
+        </w:pict>
+      </w:r>
+    </w:p>
+    <w:p>
+      <w:pPr>
+        <w:spacing w:before="100" w:beforeAutospacing="1" w:after="100" w:afterAutospacing="1" w:line="240" w:lineRule="auto"/>
+        <w:outlineLvl w:val="1"/>
+        <w:rPr>
+          <w:rFonts w:ascii="Times New Roman" w:eastAsia="Times New Roman" w:hAnsi="Times New Roman" w:cs="Times New Roman"/>
+          <w:b/>
+          <w:bCs/>
+          <w:kern w:val="0"/>
+          <w:sz w:val="36"/>
+          <w:szCs w:val="36"/>
+          <w14:ligatures w14:val="none"/>
+        </w:rPr>
+      </w:pPr>
+      <w:r>
+        <w:rPr>
+          <w:rFonts w:ascii="Times New Roman" w:eastAsia="Times New Roman" w:hAnsi="Times New Roman" w:cs="Times New Roman"/>
+          <w:b/>
+          <w:bCs/>
+          <w:kern w:val="0"/>
+          <w:sz w:val="36"/>
+          <w:szCs w:val="36"/>
+          <w14:ligatures w14:val="none"/>
+        </w:rPr>
+        <w:t>Reflect</w:t>
+      </w:r>
+    </w:p>
+    <w:p>
+      <w:pPr>
+        <w:numPr>
+          <w:ilvl w:val="0"/>
+          <w:numId w:val="4"/>
+        </w:numPr>
+        <w:spacing w:before="100" w:beforeAutospacing="1" w:after="100" w:afterAutospacing="1" w:line="240" w:lineRule="auto"/>
+        <w:rPr>
+          <w:rFonts w:ascii="Times New Roman" w:eastAsia="Times New Roman" w:hAnsi="Times New Roman" w:cs="Times New Roman"/>
+          <w:kern w:val="0"/>
+          <w14:ligatures w14:val="none"/>
+        </w:rPr>
+      </w:pPr>
+      <w:r>
+        <w:rPr>
+          <w:rFonts w:ascii="Times New Roman" w:eastAsia="Times New Roman" w:hAnsi="Times New Roman" w:cs="Times New Roman"/>
+          <w:kern w:val="0"/>
+          <w14:ligatures w14:val="none"/>
+        </w:rPr>
+        <w:t xml:space="preserve">Which ADHD symptoms have had the greatest impact on your life? </w:t>
+      </w:r>
+    </w:p>
+    <w:p>
+      <w:pPr>
+        <w:numPr>
+          <w:ilvl w:val="0"/>
+          <w:numId w:val="4"/>
+        </w:numPr>
+        <w:spacing w:before="100" w:beforeAutospacing="1" w:after="100" w:afterAutospacing="1" w:line="240" w:lineRule="auto"/>
+        <w:rPr>
+          <w:rFonts w:ascii="Times New Roman" w:eastAsia="Times New Roman" w:hAnsi="Times New Roman" w:cs="Times New Roman"/>
+          <w:kern w:val="0"/>
+          <w14:ligatures w14:val="none"/>
+        </w:rPr>
+      </w:pPr>
+      <w:r>
+        <w:rPr>
+          <w:rFonts w:ascii="Times New Roman" w:eastAsia="Times New Roman" w:hAnsi="Times New Roman" w:cs="Times New Roman"/>
+          <w:kern w:val="0"/>
+          <w14:ligatures w14:val="none"/>
+        </w:rPr>
+        <w:t xml:space="preserve">Have you ever mistaken your ADHD symptoms for laziness, lack of intelligence, or a lack of effort? </w:t>
+      </w:r>
+    </w:p>
+    <w:p>
+      <w:pPr>
+        <w:numPr>
+          <w:ilvl w:val="0"/>
+          <w:numId w:val="4"/>
+        </w:numPr>
+        <w:spacing w:before="100" w:beforeAutospacing="1" w:after="100" w:afterAutospacing="1" w:line="240" w:lineRule="auto"/>
+        <w:rPr>
+          <w:rFonts w:ascii="Times New Roman" w:eastAsia="Times New Roman" w:hAnsi="Times New Roman" w:cs="Times New Roman"/>
+          <w:kern w:val="0"/>
+          <w14:ligatures w14:val="none"/>
+        </w:rPr>
+      </w:pPr>
+      <w:r>
+        <w:rPr>
+          <w:rFonts w:ascii="Times New Roman" w:eastAsia="Times New Roman" w:hAnsi="Times New Roman" w:cs="Times New Roman"/>
+          <w:kern w:val="0"/>
+          <w14:ligatures w14:val="none"/>
+        </w:rPr>
+        <w:t xml:space="preserve">When do you notice yourself focusing exceptionally well? What do those situations have in common? </w:t>
+      </w:r>
+    </w:p>
+    <w:p>
+      <w:pPr>
+        <w:spacing w:after="0" w:line="240" w:lineRule="auto"/>
+        <w:rPr>
+          <w:rFonts w:ascii="Times New Roman" w:eastAsia="Times New Roman" w:hAnsi="Times New Roman" w:cs="Times New Roman"/>
+          <w:kern w:val="0"/>
+          <w14:ligatures w14:val="none"/>
+        </w:rPr>
+      </w:pPr>
+      <w:r>
+        <w:rPr>
+          <w:rFonts w:ascii="Times New Roman" w:eastAsia="Times New Roman" w:hAnsi="Times New Roman" w:cs="Times New Roman"/>
+          <w:noProof/>
+          <w:kern w:val="0"/>
+        </w:rPr>
+        <w:pict w14:anchorId="246015EE">
+          <v:rect id="_x0000_i1026" alt="" style="width:468pt;height:.05pt;mso-width-percent:0;mso-height-percent:0;mso-width-percent:0;mso-height-percent:0" o:hralign="center" o:hrstd="t" o:hr="t" fillcolor="#a0a0a0" stroked="f"/>
+        </w:pict>
+      </w:r>
+    </w:p>
+    <w:p>
+      <w:pPr>
+        <w:spacing w:before="100" w:beforeAutospacing="1" w:after="100" w:afterAutospacing="1" w:line="240" w:lineRule="auto"/>
+        <w:outlineLvl w:val="1"/>
+        <w:rPr>
+          <w:rFonts w:ascii="Times New Roman" w:eastAsia="Times New Roman" w:hAnsi="Times New Roman" w:cs="Times New Roman"/>
+          <w:b/>
+          <w:bCs/>
+          <w:kern w:val="0"/>
+          <w:sz w:val="36"/>
+          <w:szCs w:val="36"/>
+          <w14:ligatures w14:val="none"/>
+        </w:rPr>
+      </w:pPr>
+      <w:r>
+        <w:rPr>
+          <w:rFonts w:ascii="Times New Roman" w:eastAsia="Times New Roman" w:hAnsi="Times New Roman" w:cs="Times New Roman"/>
+          <w:b/>
+          <w:bCs/>
+          <w:kern w:val="0"/>
+          <w:sz w:val="36"/>
+          <w:szCs w:val="36"/>
+          <w14:ligatures w14:val="none"/>
+        </w:rPr>
+        <w:lastRenderedPageBreak/>
+        <w:t>Put It Into Practice</w:t>
+      </w:r>
+    </w:p>
+    <w:p>
+      <w:pPr>
+        <w:spacing w:before="100" w:beforeAutospacing="1" w:after="100" w:afterAutospacing="1" w:line="240" w:lineRule="auto"/>
+        <w:rPr>
+          <w:rFonts w:ascii="Times New Roman" w:eastAsia="Times New Roman" w:hAnsi="Times New Roman" w:cs="Times New Roman"/>
+          <w:kern w:val="0"/>
+          <w14:ligatures w14:val="none"/>
+        </w:rPr>
+      </w:pPr>
+      <w:r>
+        <w:rPr>
+          <w:rFonts w:ascii="Times New Roman" w:eastAsia="Times New Roman" w:hAnsi="Times New Roman" w:cs="Times New Roman"/>
+          <w:kern w:val="0"/>
+          <w14:ligatures w14:val="none"/>
+        </w:rPr>
+        <w:t>This week, spend a few days simply observing how your attention works.</w:t>
+      </w:r>
+      <w:r>
+        <w:rPr>
+          <w:rFonts w:ascii="Times New Roman" w:eastAsia="Times New Roman" w:hAnsi="Times New Roman" w:cs="Times New Roman"/>
+          <w:kern w:val="0"/>
+          <w14:ligatures w14:val="none"/>
+        </w:rPr>
+        <w:t xml:space="preserve"> </w:t>
+      </w:r>
+      <w:r>
+        <w:rPr>
+          <w:rFonts w:ascii="Times New Roman" w:eastAsia="Times New Roman" w:hAnsi="Times New Roman" w:cs="Times New Roman"/>
+          <w:kern w:val="0"/>
+          <w14:ligatures w14:val="none"/>
+        </w:rPr>
+        <w:t>Without judging yourself, notice:</w:t>
+      </w:r>
+    </w:p>
+    <w:p>
+      <w:pPr>
+        <w:numPr>
+          <w:ilvl w:val="0"/>
+          <w:numId w:val="5"/>
+        </w:numPr>
+        <w:spacing w:before="100" w:beforeAutospacing="1" w:after="100" w:afterAutospacing="1" w:line="240" w:lineRule="auto"/>
+        <w:rPr>
+          <w:rFonts w:ascii="Times New Roman" w:eastAsia="Times New Roman" w:hAnsi="Times New Roman" w:cs="Times New Roman"/>
+          <w:kern w:val="0"/>
+          <w14:ligatures w14:val="none"/>
+        </w:rPr>
+      </w:pPr>
+      <w:r>
+        <w:rPr>
+          <w:rFonts w:ascii="Times New Roman" w:eastAsia="Times New Roman" w:hAnsi="Times New Roman" w:cs="Times New Roman"/>
+          <w:kern w:val="0"/>
+          <w14:ligatures w14:val="none"/>
+        </w:rPr>
+        <w:t xml:space="preserve">Which activities naturally hold your attention? </w:t>
+      </w:r>
+    </w:p>
+    <w:p>
+      <w:pPr>
+        <w:numPr>
+          <w:ilvl w:val="0"/>
+          <w:numId w:val="5"/>
+        </w:numPr>
+        <w:spacing w:before="100" w:beforeAutospacing="1" w:after="100" w:afterAutospacing="1" w:line="240" w:lineRule="auto"/>
+        <w:rPr>
+          <w:rFonts w:ascii="Times New Roman" w:eastAsia="Times New Roman" w:hAnsi="Times New Roman" w:cs="Times New Roman"/>
+          <w:kern w:val="0"/>
+          <w14:ligatures w14:val="none"/>
+        </w:rPr>
+      </w:pPr>
+      <w:r>
+        <w:rPr>
+          <w:rFonts w:ascii="Times New Roman" w:eastAsia="Times New Roman" w:hAnsi="Times New Roman" w:cs="Times New Roman"/>
+          <w:kern w:val="0"/>
+          <w14:ligatures w14:val="none"/>
+        </w:rPr>
+        <w:t xml:space="preserve">Which tasks do you consistently procrastinate on? </w:t>
+      </w:r>
+    </w:p>
+    <w:p>
+      <w:pPr>
+        <w:numPr>
+          <w:ilvl w:val="0"/>
+          <w:numId w:val="5"/>
+        </w:numPr>
+        <w:spacing w:before="100" w:beforeAutospacing="1" w:after="100" w:afterAutospacing="1" w:line="240" w:lineRule="auto"/>
+        <w:rPr>
+          <w:rFonts w:ascii="Times New Roman" w:eastAsia="Times New Roman" w:hAnsi="Times New Roman" w:cs="Times New Roman"/>
+          <w:kern w:val="0"/>
+          <w14:ligatures w14:val="none"/>
+        </w:rPr>
+      </w:pPr>
+      <w:r>
+        <w:rPr>
+          <w:rFonts w:ascii="Times New Roman" w:eastAsia="Times New Roman" w:hAnsi="Times New Roman" w:cs="Times New Roman"/>
+          <w:kern w:val="0"/>
+          <w14:ligatures w14:val="none"/>
+        </w:rPr>
+        <w:t xml:space="preserve">What environments help you focus? </w:t>
+      </w:r>
+    </w:p>
+    <w:p>
+      <w:pPr>
+        <w:numPr>
+          <w:ilvl w:val="0"/>
+          <w:numId w:val="5"/>
+        </w:numPr>
+        <w:spacing w:before="100" w:beforeAutospacing="1" w:after="100" w:afterAutospacing="1" w:line="240" w:lineRule="auto"/>
+        <w:rPr>
+          <w:rFonts w:ascii="Times New Roman" w:eastAsia="Times New Roman" w:hAnsi="Times New Roman" w:cs="Times New Roman"/>
+          <w:kern w:val="0"/>
+          <w14:ligatures w14:val="none"/>
+        </w:rPr>
+      </w:pPr>
+      <w:r>
+        <w:rPr>
+          <w:rFonts w:ascii="Times New Roman" w:eastAsia="Times New Roman" w:hAnsi="Times New Roman" w:cs="Times New Roman"/>
+          <w:kern w:val="0"/>
+          <w14:ligatures w14:val="none"/>
+        </w:rPr>
+        <w:t xml:space="preserve">What distractions pull your attention away most often? </w:t>
+      </w:r>
+    </w:p>
+    <w:p>
+      <w:pPr>
+        <w:numPr>
+          <w:ilvl w:val="0"/>
+          <w:numId w:val="5"/>
+        </w:numPr>
+        <w:spacing w:before="100" w:beforeAutospacing="1" w:after="100" w:afterAutospacing="1" w:line="240" w:lineRule="auto"/>
+        <w:rPr>
+          <w:rFonts w:ascii="Times New Roman" w:eastAsia="Times New Roman" w:hAnsi="Times New Roman" w:cs="Times New Roman"/>
+          <w:kern w:val="0"/>
+          <w14:ligatures w14:val="none"/>
+        </w:rPr>
+      </w:pPr>
+      <w:r>
+        <w:rPr>
+          <w:rFonts w:ascii="Times New Roman" w:eastAsia="Times New Roman" w:hAnsi="Times New Roman" w:cs="Times New Roman"/>
+          <w:kern w:val="0"/>
+          <w14:ligatures w14:val="none"/>
+        </w:rPr>
+        <w:t xml:space="preserve">Are there certain times of day when you think more clearly or feel more productive? </w:t>
+      </w:r>
+    </w:p>
+    <w:p>
+      <w:pPr>
+        <w:spacing w:before="100" w:beforeAutospacing="1" w:after="100" w:afterAutospacing="1" w:line="240" w:lineRule="auto"/>
+        <w:rPr>
+          <w:rFonts w:ascii="Times New Roman" w:eastAsia="Times New Roman" w:hAnsi="Times New Roman" w:cs="Times New Roman"/>
+          <w:kern w:val="0"/>
+          <w14:ligatures w14:val="none"/>
+        </w:rPr>
+      </w:pPr>
+      <w:r>
+        <w:rPr>
+          <w:rFonts w:ascii="Times New Roman" w:eastAsia="Times New Roman" w:hAnsi="Times New Roman" w:cs="Times New Roman"/>
+          <w:kern w:val="0"/>
+          <w14:ligatures w14:val="none"/>
+        </w:rPr>
+        <w:t>The goal isn't to force yourself to concentrate harder</w:t>
+      </w:r>
+      <w:r>
+        <w:rPr>
+          <w:rFonts w:ascii="Times New Roman" w:eastAsia="Times New Roman" w:hAnsi="Times New Roman" w:cs="Times New Roman"/>
+          <w:kern w:val="0"/>
+          <w14:ligatures w14:val="none"/>
+        </w:rPr>
+        <w:t xml:space="preserve">, it’s </w:t>
+      </w:r>
+      <w:r>
+        <w:rPr>
+          <w:rFonts w:ascii="Times New Roman" w:eastAsia="Times New Roman" w:hAnsi="Times New Roman" w:cs="Times New Roman"/>
+          <w:kern w:val="0"/>
+          <w14:ligatures w14:val="none"/>
+        </w:rPr>
+        <w:t>to become a student of your own brain.</w:t>
+      </w:r>
+      <w:r>
+        <w:rPr>
+          <w:rFonts w:ascii="Times New Roman" w:eastAsia="Times New Roman" w:hAnsi="Times New Roman" w:cs="Times New Roman"/>
+          <w:kern w:val="0"/>
+          <w14:ligatures w14:val="none"/>
+        </w:rPr>
+        <w:t xml:space="preserve"> </w:t>
+      </w:r>
+      <w:r>
+        <w:rPr>
+          <w:rFonts w:ascii="Times New Roman" w:eastAsia="Times New Roman" w:hAnsi="Times New Roman" w:cs="Times New Roman"/>
+          <w:kern w:val="0"/>
+          <w14:ligatures w14:val="none"/>
+        </w:rPr>
+        <w:t xml:space="preserve">The more you understand how your attention works, the easier it becomes to build routines, environments, and strategies that work </w:t>
+      </w:r>
+      <w:r>
+        <w:rPr>
+          <w:rFonts w:ascii="Times New Roman" w:eastAsia="Times New Roman" w:hAnsi="Times New Roman" w:cs="Times New Roman"/>
+          <w:i/>
+          <w:iCs/>
+          <w:kern w:val="0"/>
+          <w14:ligatures w14:val="none"/>
+        </w:rPr>
+        <w:t>with</w:t>
+      </w:r>
+      <w:r>
+        <w:rPr>
+          <w:rFonts w:ascii="Times New Roman" w:eastAsia="Times New Roman" w:hAnsi="Times New Roman" w:cs="Times New Roman"/>
+          <w:kern w:val="0"/>
+          <w14:ligatures w14:val="none"/>
+        </w:rPr>
+        <w:t xml:space="preserve"> your brain instead of constantly fighting against it.</w:t>
+      </w:r>
+    </w:p>
+    <w:p>
+      <w:pPr>
+        <w:spacing w:after="0" w:line="240" w:lineRule="auto"/>
+        <w:rPr>
+          <w:rFonts w:ascii="Times New Roman" w:eastAsia="Times New Roman" w:hAnsi="Times New Roman" w:cs="Times New Roman"/>
+          <w:kern w:val="0"/>
+          <w14:ligatures w14:val="none"/>
+        </w:rPr>
+      </w:pPr>
+      <w:r>
+        <w:rPr>
+          <w:rFonts w:ascii="Times New Roman" w:eastAsia="Times New Roman" w:hAnsi="Times New Roman" w:cs="Times New Roman"/>
+          <w:noProof/>
+          <w:kern w:val="0"/>
+        </w:rPr>
+        <w:pict w14:anchorId="295DF305">
+          <v:rect id="_x0000_i1025" alt="" style="width:468pt;height:.05pt;mso-width-percent:0;mso-height-percent:0;mso-width-percent:0;mso-height-percent:0" o:hralign="center" o:hrstd="t" o:hr="t" fillcolor="#a0a0a0" stroked="f"/>
+        </w:pict>
+      </w:r>
+    </w:p>
+    <w:p>
+      <w:pPr>
+        <w:spacing w:before="100" w:beforeAutospacing="1" w:after="100" w:afterAutospacing="1" w:line="240" w:lineRule="auto"/>
+        <w:rPr>
+          <w:rFonts w:ascii="Times New Roman" w:eastAsia="Times New Roman" w:hAnsi="Times New Roman" w:cs="Times New Roman"/>
+          <w:kern w:val="0"/>
+          <w14:ligatures w14:val="none"/>
+        </w:rPr>
+      </w:pPr>
+      <w:r>
+        <w:rPr>
+          <w:rFonts w:ascii="Times New Roman" w:eastAsia="Times New Roman" w:hAnsi="Times New Roman" w:cs="Times New Roman"/>
+          <w:i/>
+          <w:iCs/>
+          <w:kern w:val="0"/>
+          <w14:ligatures w14:val="none"/>
+        </w:rPr>
+        <w:t>"Knowing yourself is the beginning of all wisdom."</w:t>
+      </w:r>
+      <w:r>
+        <w:rPr>
+          <w:rFonts w:ascii="Times New Roman" w:eastAsia="Times New Roman" w:hAnsi="Times New Roman" w:cs="Times New Roman"/>
+          <w:kern w:val="0"/>
+          <w14:ligatures w14:val="none"/>
+        </w:rPr>
+        <w:t xml:space="preserve"> — Aristotle</w:t>
       </w:r>
     </w:p>
     <w:p/>
@@ -1275,7 +1831,7 @@
 </file>
 
 <file path=word/numbering.xml><?xml version="1.0" encoding="utf-8"?>
-<w:numbering xmlns:wpc="http://schemas.microsoft.com/office/word/2010/wordprocessingCanvas" xmlns:cx="http://schemas.microsoft.com/office/drawing/2014/chartex" xmlns:cx1="http://schemas.microsoft.com/office/drawing/2015/9/8/chartex" xmlns:cx2="http://schemas.microsoft.com/office/drawing/2015/10/21/chartex" xmlns:cx3="http://schemas.microsoft.com/office/drawing/2016/5/9/chartex" xmlns:cx4="http://schemas.microsoft.com/office/drawing/2016/5/10/chartex" xmlns:cx5="http://schemas.microsoft.com/office/drawing/2016/5/11/chartex" xmlns:cx6="http://schemas.microsoft.com/office/drawing/2016/5/12/chartex" xmlns:cx7="http://schemas.microsoft.com/office/drawing/2016/5/13/chartex" xmlns:cx8="http://schemas.microsoft.com/office/drawing/2016/5/14/chartex" xmlns:mc="http://schemas.openxmlformats.org/markup-compatibility/2006" xmlns:aink="http://schemas.microsoft.com/office/drawing/2016/ink" xmlns:am3d="http://schemas.microsoft.com/office/drawing/2017/model3d" xmlns:o="urn:schemas-microsoft-com:office:office" xmlns:oel="http://schemas.microsoft.com/office/2019/extlst" xmlns:r="http://schemas.openxmlformats.org/officeDocument/2006/relationships" xmlns:m="http://schemas.openxmlformats.org/officeDocument/2006/math" xmlns:v="urn:schemas-microsoft-com:vml" xmlns:wp14="http://schemas.microsoft.com/office/word/2010/wordprocessingDrawing" xmlns:wp="http://schemas.openxmlformats.org/drawingml/2006/wordprocessingDrawing" xmlns:w10="urn:schemas-microsoft-com:office:word" xmlns:w="http://schemas.openxmlformats.org/wordprocessingml/2006/main" xmlns:w14="http://schemas.microsoft.com/office/word/2010/wordml" xmlns:w15="http://schemas.microsoft.com/office/word/2012/wordml" xmlns:w16cex="http://schemas.microsoft.com/office/word/2018/wordml/cex" xmlns:w16cid="http://schemas.microsoft.com/office/word/2016/wordml/cid" xmlns:w16="http://schemas.microsoft.com/office/word/2018/wordml" xmlns:w16du="http://schemas.microsoft.com/office/word/2023/wordml/word16du" xmlns:w16sdtdh="http://schemas.microsoft.com/office/word/2020/wordml/sdtdatahash" xmlns:w16sdtfl="http://schemas.microsoft.com/office/word/2024/wordml/sdtformatlock" xmlns:w16se="http://schemas.microsoft.com/office/word/2015/wordml/symex" xmlns:wpg="http://schemas.microsoft.com/office/word/2010/wordprocessingGroup" xmlns:wpi="http://schemas.microsoft.com/office/word/2010/wordprocessingInk" xmlns:wne="http://schemas.microsoft.com/office/word/2006/wordml" xmlns:wps="http://schemas.microsoft.com/office/word/2010/wordprocessingShape" mc:Ignorable="w14 w15 w16se w16cid w16 w16cex w16sdtdh w16sdtfl w16du wp14">
+<w:numbering xmlns:wpc="http://schemas.microsoft.com/office/word/2010/wordprocessingCanvas" xmlns:cx="http://schemas.microsoft.com/office/drawing/2014/chartex" xmlns:cx1="http://schemas.microsoft.com/office/drawing/2015/9/8/chartex" xmlns:cx2="http://schemas.microsoft.com/office/drawing/2015/10/21/chartex" xmlns:cx3="http://schemas.microsoft.com/office/drawing/2016/5/9/chartex" xmlns:cx4="http://schemas.microsoft.com/office/drawing/2016/5/10/chartex" xmlns:cx5="http://schemas.microsoft.com/office/drawing/2016/5/11/chartex" xmlns:cx6="http://schemas.microsoft.com/office/drawing/2016/5/12/chartex" xmlns:cx7="http://schemas.microsoft.com/office/drawing/2016/5/13/chartex" xmlns:cx8="http://schemas.microsoft.com/office/drawing/2016/5/14/chartex" xmlns:mc="http://schemas.openxmlformats.org/markup-compatibility/2006" xmlns:m="http://schemas.openxmlformats.org/officeDocument/2006/math" xmlns:aink="http://schemas.microsoft.com/office/drawing/2016/ink" xmlns:am3d="http://schemas.microsoft.com/office/drawing/2017/model3d" xmlns:oel="http://schemas.microsoft.com/office/2019/extlst" xmlns:r="http://schemas.openxmlformats.org/officeDocument/2006/relationships" xmlns:wp14="http://schemas.microsoft.com/office/word/2010/wordprocessingDrawing" xmlns:wp="http://schemas.openxmlformats.org/drawingml/2006/wordprocessingDrawing" xmlns:wpg="http://schemas.microsoft.com/office/word/2010/wordprocessingGroup" xmlns:wpi="http://schemas.microsoft.com/office/word/2010/wordprocessingInk" xmlns:wps="http://schemas.microsoft.com/office/word/2010/wordprocessingShape" xmlns:o="urn:schemas-microsoft-com:office:office" xmlns:v="urn:schemas-microsoft-com:vml" xmlns:w10="urn:schemas-microsoft-com:office:word" xmlns:w="http://schemas.openxmlformats.org/wordprocessingml/2006/main" xmlns:w14="http://schemas.microsoft.com/office/word/2010/wordml" xmlns:w15="http://schemas.microsoft.com/office/word/2012/wordml" xmlns:w16cex="http://schemas.microsoft.com/office/word/2018/wordml/cex" xmlns:w16cid="http://schemas.microsoft.com/office/word/2016/wordml/cid" xmlns:w16="http://schemas.microsoft.com/office/word/2018/wordml" xmlns:w16sdtdh="http://schemas.microsoft.com/office/word/2020/wordml/sdtdatahash" xmlns:w16sdtfl="http://schemas.microsoft.com/office/word/2024/wordml/sdtformatlock" xmlns:w16se="http://schemas.microsoft.com/office/word/2015/wordml/symex" xmlns:w16du="http://schemas.microsoft.com/office/word/2023/wordml/word16du" xmlns:wne="http://schemas.microsoft.com/office/word/2006/wordml" mc:Ignorable="w14 w15 w16se w16cid w16 w16cex w16sdtdh w16sdtfl w16du wp14">
   <w:abstractNum w:abstractNumId="0" w15:restartNumberingAfterBreak="0">
     <w:nsid w:val="0FD46FB8"/>
     <w:multiLevelType w:val="multilevel"/>
@@ -1575,6 +2131,304 @@
     </w:lvl>
   </w:abstractNum>
   <w:abstractNum w:abstractNumId="2" w15:restartNumberingAfterBreak="0">
+    <w:nsid w:val="4FB9424D"/>
+    <w:multiLevelType w:val="multilevel"/>
+    <w:tmpl w:val="A1F0F2E6"/>
+    <w:lvl w:ilvl="0">
+      <w:start w:val="1"/>
+      <w:numFmt w:val="bullet"/>
+      <w:lvlText w:val=""/>
+      <w:lvlJc w:val="left"/>
+      <w:pPr>
+        <w:tabs>
+          <w:tab w:val="num" w:pos="720"/>
+        </w:tabs>
+        <w:ind w:left="720" w:hanging="360"/>
+      </w:pPr>
+      <w:rPr>
+        <w:rFonts w:ascii="Symbol" w:hAnsi="Symbol" w:hint="default"/>
+        <w:sz w:val="20"/>
+      </w:rPr>
+    </w:lvl>
+    <w:lvl w:ilvl="1" w:tentative="1">
+      <w:start w:val="1"/>
+      <w:numFmt w:val="bullet"/>
+      <w:lvlText w:val="o"/>
+      <w:lvlJc w:val="left"/>
+      <w:pPr>
+        <w:tabs>
+          <w:tab w:val="num" w:pos="1440"/>
+        </w:tabs>
+        <w:ind w:left="1440" w:hanging="360"/>
+      </w:pPr>
+      <w:rPr>
+        <w:rFonts w:ascii="Courier New" w:hAnsi="Courier New" w:hint="default"/>
+        <w:sz w:val="20"/>
+      </w:rPr>
+    </w:lvl>
+    <w:lvl w:ilvl="2" w:tentative="1">
+      <w:start w:val="1"/>
+      <w:numFmt w:val="bullet"/>
+      <w:lvlText w:val=""/>
+      <w:lvlJc w:val="left"/>
+      <w:pPr>
+        <w:tabs>
+          <w:tab w:val="num" w:pos="2160"/>
+        </w:tabs>
+        <w:ind w:left="2160" w:hanging="360"/>
+      </w:pPr>
+      <w:rPr>
+        <w:rFonts w:ascii="Wingdings" w:hAnsi="Wingdings" w:hint="default"/>
+        <w:sz w:val="20"/>
+      </w:rPr>
+    </w:lvl>
+    <w:lvl w:ilvl="3" w:tentative="1">
+      <w:start w:val="1"/>
+      <w:numFmt w:val="bullet"/>
+      <w:lvlText w:val=""/>
+      <w:lvlJc w:val="left"/>
+      <w:pPr>
+        <w:tabs>
+          <w:tab w:val="num" w:pos="2880"/>
+        </w:tabs>
+        <w:ind w:left="2880" w:hanging="360"/>
+      </w:pPr>
+      <w:rPr>
+        <w:rFonts w:ascii="Wingdings" w:hAnsi="Wingdings" w:hint="default"/>
+        <w:sz w:val="20"/>
+      </w:rPr>
+    </w:lvl>
+    <w:lvl w:ilvl="4" w:tentative="1">
+      <w:start w:val="1"/>
+      <w:numFmt w:val="bullet"/>
+      <w:lvlText w:val=""/>
+      <w:lvlJc w:val="left"/>
+      <w:pPr>
+        <w:tabs>
+          <w:tab w:val="num" w:pos="3600"/>
+        </w:tabs>
+        <w:ind w:left="3600" w:hanging="360"/>
+      </w:pPr>
+      <w:rPr>
+        <w:rFonts w:ascii="Wingdings" w:hAnsi="Wingdings" w:hint="default"/>
+        <w:sz w:val="20"/>
+      </w:rPr>
+    </w:lvl>
+    <w:lvl w:ilvl="5" w:tentative="1">
+      <w:start w:val="1"/>
+      <w:numFmt w:val="bullet"/>
+      <w:lvlText w:val=""/>
+      <w:lvlJc w:val="left"/>
+      <w:pPr>
+        <w:tabs>
+          <w:tab w:val="num" w:pos="4320"/>
+        </w:tabs>
+        <w:ind w:left="4320" w:hanging="360"/>
+      </w:pPr>
+      <w:rPr>
+        <w:rFonts w:ascii="Wingdings" w:hAnsi="Wingdings" w:hint="default"/>
+        <w:sz w:val="20"/>
+      </w:rPr>
+    </w:lvl>
+    <w:lvl w:ilvl="6" w:tentative="1">
+      <w:start w:val="1"/>
+      <w:numFmt w:val="bullet"/>
+      <w:lvlText w:val=""/>
+      <w:lvlJc w:val="left"/>
+      <w:pPr>
+        <w:tabs>
+          <w:tab w:val="num" w:pos="5040"/>
+        </w:tabs>
+        <w:ind w:left="5040" w:hanging="360"/>
+      </w:pPr>
+      <w:rPr>
+        <w:rFonts w:ascii="Wingdings" w:hAnsi="Wingdings" w:hint="default"/>
+        <w:sz w:val="20"/>
+      </w:rPr>
+    </w:lvl>
+    <w:lvl w:ilvl="7" w:tentative="1">
+      <w:start w:val="1"/>
+      <w:numFmt w:val="bullet"/>
+      <w:lvlText w:val=""/>
+      <w:lvlJc w:val="left"/>
+      <w:pPr>
+        <w:tabs>
+          <w:tab w:val="num" w:pos="5760"/>
+        </w:tabs>
+        <w:ind w:left="5760" w:hanging="360"/>
+      </w:pPr>
+      <w:rPr>
+        <w:rFonts w:ascii="Wingdings" w:hAnsi="Wingdings" w:hint="default"/>
+        <w:sz w:val="20"/>
+      </w:rPr>
+    </w:lvl>
+    <w:lvl w:ilvl="8" w:tentative="1">
+      <w:start w:val="1"/>
+      <w:numFmt w:val="bullet"/>
+      <w:lvlText w:val=""/>
+      <w:lvlJc w:val="left"/>
+      <w:pPr>
+        <w:tabs>
+          <w:tab w:val="num" w:pos="6480"/>
+        </w:tabs>
+        <w:ind w:left="6480" w:hanging="360"/>
+      </w:pPr>
+      <w:rPr>
+        <w:rFonts w:ascii="Wingdings" w:hAnsi="Wingdings" w:hint="default"/>
+        <w:sz w:val="20"/>
+      </w:rPr>
+    </w:lvl>
+  </w:abstractNum>
+  <w:abstractNum w:abstractNumId="3" w15:restartNumberingAfterBreak="0">
+    <w:nsid w:val="51DD51C0"/>
+    <w:multiLevelType w:val="multilevel"/>
+    <w:tmpl w:val="E110A2D0"/>
+    <w:lvl w:ilvl="0">
+      <w:start w:val="1"/>
+      <w:numFmt w:val="bullet"/>
+      <w:lvlText w:val=""/>
+      <w:lvlJc w:val="left"/>
+      <w:pPr>
+        <w:tabs>
+          <w:tab w:val="num" w:pos="720"/>
+        </w:tabs>
+        <w:ind w:left="720" w:hanging="360"/>
+      </w:pPr>
+      <w:rPr>
+        <w:rFonts w:ascii="Symbol" w:hAnsi="Symbol" w:hint="default"/>
+        <w:sz w:val="20"/>
+      </w:rPr>
+    </w:lvl>
+    <w:lvl w:ilvl="1" w:tentative="1">
+      <w:start w:val="1"/>
+      <w:numFmt w:val="bullet"/>
+      <w:lvlText w:val="o"/>
+      <w:lvlJc w:val="left"/>
+      <w:pPr>
+        <w:tabs>
+          <w:tab w:val="num" w:pos="1440"/>
+        </w:tabs>
+        <w:ind w:left="1440" w:hanging="360"/>
+      </w:pPr>
+      <w:rPr>
+        <w:rFonts w:ascii="Courier New" w:hAnsi="Courier New" w:hint="default"/>
+        <w:sz w:val="20"/>
+      </w:rPr>
+    </w:lvl>
+    <w:lvl w:ilvl="2" w:tentative="1">
+      <w:start w:val="1"/>
+      <w:numFmt w:val="bullet"/>
+      <w:lvlText w:val=""/>
+      <w:lvlJc w:val="left"/>
+      <w:pPr>
+        <w:tabs>
+          <w:tab w:val="num" w:pos="2160"/>
+        </w:tabs>
+        <w:ind w:left="2160" w:hanging="360"/>
+      </w:pPr>
+      <w:rPr>
+        <w:rFonts w:ascii="Wingdings" w:hAnsi="Wingdings" w:hint="default"/>
+        <w:sz w:val="20"/>
+      </w:rPr>
+    </w:lvl>
+    <w:lvl w:ilvl="3" w:tentative="1">
+      <w:start w:val="1"/>
+      <w:numFmt w:val="bullet"/>
+      <w:lvlText w:val=""/>
+      <w:lvlJc w:val="left"/>
+      <w:pPr>
+        <w:tabs>
+          <w:tab w:val="num" w:pos="2880"/>
+        </w:tabs>
+        <w:ind w:left="2880" w:hanging="360"/>
+      </w:pPr>
+      <w:rPr>
+        <w:rFonts w:ascii="Wingdings" w:hAnsi="Wingdings" w:hint="default"/>
+        <w:sz w:val="20"/>
+      </w:rPr>
+    </w:lvl>
+    <w:lvl w:ilvl="4" w:tentative="1">
+      <w:start w:val="1"/>
+      <w:numFmt w:val="bullet"/>
+      <w:lvlText w:val=""/>
+      <w:lvlJc w:val="left"/>
+      <w:pPr>
+        <w:tabs>
+          <w:tab w:val="num" w:pos="3600"/>
+        </w:tabs>
+        <w:ind w:left="3600" w:hanging="360"/>
+      </w:pPr>
+      <w:rPr>
+        <w:rFonts w:ascii="Wingdings" w:hAnsi="Wingdings" w:hint="default"/>
+        <w:sz w:val="20"/>
+      </w:rPr>
+    </w:lvl>
+    <w:lvl w:ilvl="5" w:tentative="1">
+      <w:start w:val="1"/>
+      <w:numFmt w:val="bullet"/>
+      <w:lvlText w:val=""/>
+      <w:lvlJc w:val="left"/>
+      <w:pPr>
+        <w:tabs>
+          <w:tab w:val="num" w:pos="4320"/>
+        </w:tabs>
+        <w:ind w:left="4320" w:hanging="360"/>
+      </w:pPr>
+      <w:rPr>
+        <w:rFonts w:ascii="Wingdings" w:hAnsi="Wingdings" w:hint="default"/>
+        <w:sz w:val="20"/>
+      </w:rPr>
+    </w:lvl>
+    <w:lvl w:ilvl="6" w:tentative="1">
+      <w:start w:val="1"/>
+      <w:numFmt w:val="bullet"/>
+      <w:lvlText w:val=""/>
+      <w:lvlJc w:val="left"/>
+      <w:pPr>
+        <w:tabs>
+          <w:tab w:val="num" w:pos="5040"/>
+        </w:tabs>
+        <w:ind w:left="5040" w:hanging="360"/>
+      </w:pPr>
+      <w:rPr>
+        <w:rFonts w:ascii="Wingdings" w:hAnsi="Wingdings" w:hint="default"/>
+        <w:sz w:val="20"/>
+      </w:rPr>
+    </w:lvl>
+    <w:lvl w:ilvl="7" w:tentative="1">
+      <w:start w:val="1"/>
+      <w:numFmt w:val="bullet"/>
+      <w:lvlText w:val=""/>
+      <w:lvlJc w:val="left"/>
+      <w:pPr>
+        <w:tabs>
+          <w:tab w:val="num" w:pos="5760"/>
+        </w:tabs>
+        <w:ind w:left="5760" w:hanging="360"/>
+      </w:pPr>
+      <w:rPr>
+        <w:rFonts w:ascii="Wingdings" w:hAnsi="Wingdings" w:hint="default"/>
+        <w:sz w:val="20"/>
+      </w:rPr>
+    </w:lvl>
+    <w:lvl w:ilvl="8" w:tentative="1">
+      <w:start w:val="1"/>
+      <w:numFmt w:val="bullet"/>
+      <w:lvlText w:val=""/>
+      <w:lvlJc w:val="left"/>
+      <w:pPr>
+        <w:tabs>
+          <w:tab w:val="num" w:pos="6480"/>
+        </w:tabs>
+        <w:ind w:left="6480" w:hanging="360"/>
+      </w:pPr>
+      <w:rPr>
+        <w:rFonts w:ascii="Wingdings" w:hAnsi="Wingdings" w:hint="default"/>
+        <w:sz w:val="20"/>
+      </w:rPr>
+    </w:lvl>
+  </w:abstractNum>
+  <w:abstractNum w:abstractNumId="4" w15:restartNumberingAfterBreak="0">
     <w:nsid w:val="68F70C34"/>
     <w:multiLevelType w:val="multilevel"/>
     <w:tmpl w:val="C5F28EB2"/>
@@ -1730,13 +2584,19 @@
     <w:abstractNumId w:val="1"/>
   </w:num>
   <w:num w:numId="3" w16cid:durableId="1903826108">
+    <w:abstractNumId w:val="4"/>
+  </w:num>
+  <w:num w:numId="4" w16cid:durableId="1933928109">
     <w:abstractNumId w:val="2"/>
+  </w:num>
+  <w:num w:numId="5" w16cid:durableId="1064260023">
+    <w:abstractNumId w:val="3"/>
   </w:num>
 </w:numbering>
 </file>
 
 <file path=word/styles.xml><?xml version="1.0" encoding="utf-8"?>
-<w:styles xmlns:mc="http://schemas.openxmlformats.org/markup-compatibility/2006" xmlns:r="http://schemas.openxmlformats.org/officeDocument/2006/relationships" xmlns:w="http://schemas.openxmlformats.org/wordprocessingml/2006/main" xmlns:w14="http://schemas.microsoft.com/office/word/2010/wordml" xmlns:w15="http://schemas.microsoft.com/office/word/2012/wordml" xmlns:w16cex="http://schemas.microsoft.com/office/word/2018/wordml/cex" xmlns:w16cid="http://schemas.microsoft.com/office/word/2016/wordml/cid" xmlns:w16="http://schemas.microsoft.com/office/word/2018/wordml" xmlns:w16du="http://schemas.microsoft.com/office/word/2023/wordml/word16du" xmlns:w16sdtdh="http://schemas.microsoft.com/office/word/2020/wordml/sdtdatahash" xmlns:w16sdtfl="http://schemas.microsoft.com/office/word/2024/wordml/sdtformatlock" xmlns:w16se="http://schemas.microsoft.com/office/word/2015/wordml/symex" mc:Ignorable="w14 w15 w16se w16cid w16 w16cex w16sdtdh w16sdtfl w16du">
+<w:styles xmlns:mc="http://schemas.openxmlformats.org/markup-compatibility/2006" xmlns:r="http://schemas.openxmlformats.org/officeDocument/2006/relationships" xmlns:w="http://schemas.openxmlformats.org/wordprocessingml/2006/main" xmlns:w14="http://schemas.microsoft.com/office/word/2010/wordml" xmlns:w15="http://schemas.microsoft.com/office/word/2012/wordml" xmlns:w16cex="http://schemas.microsoft.com/office/word/2018/wordml/cex" xmlns:w16cid="http://schemas.microsoft.com/office/word/2016/wordml/cid" xmlns:w16="http://schemas.microsoft.com/office/word/2018/wordml" xmlns:w16sdtdh="http://schemas.microsoft.com/office/word/2020/wordml/sdtdatahash" xmlns:w16sdtfl="http://schemas.microsoft.com/office/word/2024/wordml/sdtformatlock" xmlns:w16se="http://schemas.microsoft.com/office/word/2015/wordml/symex" xmlns:w16du="http://schemas.microsoft.com/office/word/2023/wordml/word16du" mc:Ignorable="w14 w15 w16se w16cid w16 w16cex w16sdtdh w16sdtfl w16du">
   <w:docDefaults>
     <w:rPrDefault>
       <w:rPr>

</xml_diff>